<commit_message>
docs(appendix): mark Appendix 1 worked examples as synthetic
Three wording fixes in Multimedia Appendix 1 so no example implies a real
institutional system: examples are produced 'on a synthetic database';
the mixed-units rationale refers to 'this synthetic lab system'; the
ICD-10 E11% choice is 'per the synthetic organization's coding
convention'. The examples use MIMIC-III-style codes throughout.
Appendices rebuilt; package refreshed.

Refs #556

Co-Authored-By: Claude Fable 5 <noreply@anthropic.com>
</commit_message>
<xml_diff>
--- a/ARCHIVED/20260712_IJMR-Submission/multimedia_appendix_1.docx
+++ b/ARCHIVED/20260712_IJMR-Submission/multimedia_appendix_1.docx
@@ -262,7 +262,7 @@
         <w:pStyle w:val="FirstParagraph"/>
       </w:pPr>
       <w:r>
-        <w:t xml:space="preserve">The worked examples below show the artifacts this process produces.</w:t>
+        <w:t xml:space="preserve">The worked examples below show the artifacts this process produces on a synthetic database.</w:t>
       </w:r>
     </w:p>
     <w:p>
@@ -640,7 +640,7 @@
         <w:t xml:space="preserve"> </w:t>
       </w:r>
       <w:r>
-        <w:t xml:space="preserve">Aligned with NCQA HEDIS measures for Comprehensive Diabetes Care (CDC), monitoring HbA1c testing compliance in older adult populations. Uses ICD-10 E11% for Type 2 Diabetes specifically (not E10% for Type 1) per organizational coding convention. Six-month window matches the HEDIS reporting period.</w:t>
+        <w:t xml:space="preserve">Aligned with NCQA HEDIS measures for Comprehensive Diabetes Care (CDC), monitoring HbA1c testing compliance in older adult populations. Uses ICD-10 E11% for Type 2 Diabetes specifically (not E10% for Type 1) per the synthetic organization’s coding convention. Six-month window matches the HEDIS reporting period.</w:t>
       </w:r>
     </w:p>
     <w:p>
@@ -1682,7 +1682,7 @@
         <w:t xml:space="preserve">‘HOSPICE’</w:t>
       </w:r>
       <w:r>
-        <w:t xml:space="preserve">). Creatinine unit normalization (mmol/L to mg/dL via /88.4) required because our lab system stores results in mixed units depending on the originating facility. Lab item IDs 50912 and 50913 are MIMIC-III creatinine codes; local implementations must map to their own lab dictionary.</w:t>
+        <w:t xml:space="preserve">). Creatinine unit normalization (mmol/L to mg/dL via /88.4) required because this synthetic lab system stores results in mixed units depending on the originating facility. Lab item IDs 50912 and 50913 are MIMIC-III creatinine codes; local implementations must map to their own lab dictionary.</w:t>
       </w:r>
     </w:p>
     <w:p>

</xml_diff>